<commit_message>
Included github link in documentation
</commit_message>
<xml_diff>
--- a/Docker Assignment.docx
+++ b/Docker Assignment.docx
@@ -249,7 +249,48 @@
         </w:drawing>
       </w:r>
     </w:p>
-    <w:p/>
+    <w:p>
+      <w:r>
+        <w:rPr>
+          <w:b/>
+          <w:bCs/>
+          <w:sz w:val="32"/>
+          <w:szCs w:val="32"/>
+          <w:u w:val="single"/>
+        </w:rPr>
+        <w:t xml:space="preserve">GitHub </w:t>
+      </w:r>
+      <w:r>
+        <w:rPr>
+          <w:b/>
+          <w:bCs/>
+          <w:sz w:val="32"/>
+          <w:szCs w:val="32"/>
+          <w:u w:val="single"/>
+        </w:rPr>
+        <w:t>Repository Link:</w:t>
+      </w:r>
+      <w:r>
+        <w:rPr>
+          <w:b/>
+          <w:bCs/>
+          <w:sz w:val="32"/>
+          <w:szCs w:val="32"/>
+          <w:u w:val="single"/>
+        </w:rPr>
+        <w:br/>
+      </w:r>
+      <w:r>
+        <w:br/>
+      </w:r>
+      <w:r>
+        <w:rPr>
+          <w:sz w:val="36"/>
+          <w:szCs w:val="36"/>
+        </w:rPr>
+        <w:t>https://github.com/DanishKhan-Nagarro/DockerLearningApp</w:t>
+      </w:r>
+    </w:p>
     <w:p>
       <w:pPr>
         <w:pStyle w:val="ListParagraph"/>
@@ -337,6 +378,7 @@
         </w:numPr>
       </w:pPr>
       <w:r>
+        <w:lastRenderedPageBreak/>
         <w:t>Verify Docker Compose Installation</w:t>
       </w:r>
       <w:r>
@@ -545,6 +587,7 @@
         </w:numPr>
       </w:pPr>
       <w:r>
+        <w:lastRenderedPageBreak/>
         <w:t>Build Frontend Docker Image</w:t>
       </w:r>
       <w:r>
@@ -622,7 +665,6 @@
         </w:numPr>
       </w:pPr>
       <w:r>
-        <w:lastRenderedPageBreak/>
         <w:t>Build Backend Docker Image</w:t>
       </w:r>
       <w:r>
@@ -774,6 +816,7 @@
         </w:numPr>
       </w:pPr>
       <w:r>
+        <w:lastRenderedPageBreak/>
         <w:t>Run Backend Container</w:t>
       </w:r>
       <w:r>
@@ -956,7 +999,6 @@
         <w:rPr>
           <w:noProof/>
         </w:rPr>
-        <w:lastRenderedPageBreak/>
         <w:drawing>
           <wp:inline distT="0" distB="0" distL="0" distR="0" wp14:anchorId="23C7DF49" wp14:editId="03DA0D83">
             <wp:extent cx="6479540" cy="1024255"/>
@@ -1136,6 +1178,7 @@
         <w:br/>
       </w:r>
       <w:r>
+        <w:lastRenderedPageBreak/>
         <w:br/>
       </w:r>
       <w:r>
@@ -1462,6 +1505,7 @@
         <w:rPr>
           <w:noProof/>
         </w:rPr>
+        <w:lastRenderedPageBreak/>
         <w:drawing>
           <wp:inline distT="0" distB="0" distL="0" distR="0" wp14:anchorId="45751D49" wp14:editId="3D2EACBC">
             <wp:extent cx="5359400" cy="3389801"/>
@@ -1589,7 +1633,6 @@
         </w:numPr>
       </w:pPr>
       <w:r>
-        <w:lastRenderedPageBreak/>
         <w:t>Stop Docker Compose Application</w:t>
       </w:r>
       <w:r>
@@ -1769,6 +1812,7 @@
         <w:rPr>
           <w:noProof/>
         </w:rPr>
+        <w:lastRenderedPageBreak/>
         <w:drawing>
           <wp:inline distT="0" distB="0" distL="0" distR="0" wp14:anchorId="47C02A17" wp14:editId="7963CE44">
             <wp:extent cx="6120130" cy="755650"/>
@@ -1996,7 +2040,6 @@
         </w:numPr>
       </w:pPr>
       <w:r>
-        <w:lastRenderedPageBreak/>
         <w:t>Push Backend Image to Registry</w:t>
       </w:r>
       <w:r>
@@ -2195,6 +2238,7 @@
         <w:br/>
       </w:r>
       <w:r>
+        <w:lastRenderedPageBreak/>
         <w:br/>
       </w:r>
       <w:r>
@@ -2436,7 +2480,6 @@
         </w:numPr>
       </w:pPr>
       <w:r>
-        <w:lastRenderedPageBreak/>
         <w:t>Run Pulled Frontend Image</w:t>
       </w:r>
       <w:r>
@@ -2597,6 +2640,7 @@
         </w:numPr>
       </w:pPr>
       <w:r>
+        <w:lastRenderedPageBreak/>
         <w:t>View Docker Images</w:t>
       </w:r>
       <w:r>
@@ -2710,6 +2754,9 @@
         <w:br/>
       </w:r>
       <w:r>
+        <w:rPr>
+          <w:noProof/>
+        </w:rPr>
         <w:drawing>
           <wp:inline distT="0" distB="0" distL="0" distR="0" wp14:anchorId="7EFCE7BA" wp14:editId="457BAC01">
             <wp:extent cx="3905250" cy="3548680"/>
@@ -2756,31 +2803,34 @@
         </w:numPr>
       </w:pPr>
       <w:r>
+        <w:t xml:space="preserve">Backend Docker </w:t>
+      </w:r>
+      <w:r>
+        <w:t>File:</w:t>
+      </w:r>
+      <w:r>
+        <w:rPr>
+          <w:noProof/>
+        </w:rPr>
+        <w:t xml:space="preserve"> </w:t>
+      </w:r>
+      <w:r>
+        <w:rPr>
+          <w:noProof/>
+        </w:rPr>
+        <w:br/>
+      </w:r>
+      <w:r>
+        <w:rPr>
+          <w:noProof/>
+        </w:rPr>
+        <w:br/>
+      </w:r>
+      <w:r>
+        <w:rPr>
+          <w:noProof/>
+        </w:rPr>
         <w:lastRenderedPageBreak/>
-        <w:t xml:space="preserve">Backend Docker </w:t>
-      </w:r>
-      <w:r>
-        <w:t>File:</w:t>
-      </w:r>
-      <w:r>
-        <w:rPr>
-          <w:noProof/>
-        </w:rPr>
-        <w:t xml:space="preserve"> </w:t>
-      </w:r>
-      <w:r>
-        <w:rPr>
-          <w:noProof/>
-        </w:rPr>
-        <w:br/>
-      </w:r>
-      <w:r>
-        <w:rPr>
-          <w:noProof/>
-        </w:rPr>
-        <w:br/>
-      </w:r>
-      <w:r>
         <w:drawing>
           <wp:inline distT="0" distB="0" distL="0" distR="0" wp14:anchorId="7D0E7DFC" wp14:editId="331D1B65">
             <wp:extent cx="4006330" cy="4012565"/>
@@ -2900,7 +2950,6 @@
         <w:br/>
       </w:r>
       <w:r>
-        <w:lastRenderedPageBreak/>
         <w:br/>
       </w:r>
     </w:p>
@@ -2913,6 +2962,7 @@
         </w:numPr>
       </w:pPr>
       <w:r>
+        <w:lastRenderedPageBreak/>
         <w:t xml:space="preserve">CI/CD </w:t>
       </w:r>
       <w:proofErr w:type="gramStart"/>
@@ -2942,6 +2992,9 @@
         <w:br/>
       </w:r>
       <w:r>
+        <w:rPr>
+          <w:noProof/>
+        </w:rPr>
         <w:drawing>
           <wp:inline distT="0" distB="0" distL="0" distR="0" wp14:anchorId="31ADAF5A" wp14:editId="54C7CE0A">
             <wp:extent cx="4392930" cy="3516896"/>
@@ -4381,6 +4434,7 @@
   <w:style w:type="character" w:default="1" w:styleId="DefaultParagraphFont">
     <w:name w:val="Default Paragraph Font"/>
     <w:uiPriority w:val="1"/>
+    <w:semiHidden/>
     <w:unhideWhenUsed/>
   </w:style>
   <w:style w:type="table" w:default="1" w:styleId="TableNormal">

</xml_diff>